<commit_message>
updates on racial expressions
</commit_message>
<xml_diff>
--- a/Humanos_Caracteristicas_Raciais.docx
+++ b/Humanos_Caracteristicas_Raciais.docx
@@ -7,13 +7,7 @@
         <w:spacing w:after="20"/>
       </w:pPr>
       <w:r>
-        <w:rPr>
-          <w:rFonts w:ascii="P052" w:hAnsi="P052" w:eastAsia="P052"/>
-          <w:b/>
-          <w:color w:val="7E4E2A"/>
-          <w:sz w:val="16"/>
-        </w:rPr>
-        <w:t>POVO JOGÁVEL</w:t>
+        <w:t>RAÇA JOGÁVEL</w:t>
       </w:r>
     </w:p>
     <w:p>
@@ -71,12 +65,125 @@
         <w:spacing w:after="160"/>
       </w:pPr>
       <w:r>
-        <w:rPr>
-          <w:rFonts w:ascii="P052" w:hAnsi="P052" w:eastAsia="P052"/>
-          <w:i w:val="0"/>
-          <w:color w:val="2D241E"/>
-        </w:rPr>
-        <w:t>Humanos podem começar como uma tábula rasa racial: background, Perícias e Lores determinam suas competências iniciais. Sua herança aparece na presença que estabeleceram pelo mundo e na facilidade quase sobrenatural com que apoiam uns aos outros.</w:t>
+        <w:t>Ser Humano define capacidades inatas, não uma cultura única. Povo e Procedência registram a formação do personagem, enquanto sua herança racial aparece na presença que os Humanos estabeleceram pelo mundo e na facilidade quase sobrenatural com que apoiam uns aos outros.</w:t>
+      </w:r>
+    </w:p>
+    <w:p>
+      <w:pPr>
+        <w:pStyle w:val="Heading1"/>
+      </w:pPr>
+      <w:r>
+        <w:t>Criação de Personagem</w:t>
+      </w:r>
+    </w:p>
+    <w:p>
+      <w:pPr/>
+      <w:r>
+        <w:t>Raça. Humano.</w:t>
+      </w:r>
+    </w:p>
+    <w:p>
+      <w:pPr/>
+      <w:r>
+        <w:t>Povo. Reinos Humanos.</w:t>
+      </w:r>
+    </w:p>
+    <w:p>
+      <w:pPr>
+        <w:pStyle w:val="Heading2"/>
+      </w:pPr>
+      <w:r>
+        <w:t>Procedências Típicas</w:t>
+      </w:r>
+    </w:p>
+    <w:p>
+      <w:pPr>
+        <w:pStyle w:val="ListBullet"/>
+      </w:pPr>
+      <w:r>
+        <w:t>Argental. Competência de Lore: Cultura[Argental].</w:t>
+      </w:r>
+    </w:p>
+    <w:p>
+      <w:pPr>
+        <w:pStyle w:val="ListBullet"/>
+      </w:pPr>
+      <w:r>
+        <w:t>Porto Oriental. Competência de Lore: Cultura[Porto Oriental].</w:t>
+      </w:r>
+    </w:p>
+    <w:p>
+      <w:pPr>
+        <w:pStyle w:val="ListBullet"/>
+      </w:pPr>
+      <w:r>
+        <w:t>Montanha de Fogo. Competência de Lore: Cultura[Montanha de Fogo].</w:t>
+      </w:r>
+    </w:p>
+    <w:p>
+      <w:pPr/>
+      <w:r>
+        <w:t>A Procedência registra onde e com quem o personagem foi criado. Ela concede a Competência de Lore indicada, sem transformar conhecimentos culturais em características raciais.</w:t>
+      </w:r>
+    </w:p>
+    <w:p>
+      <w:pPr>
+        <w:pStyle w:val="Heading2"/>
+      </w:pPr>
+      <w:r>
+        <w:t>Herança Mista</w:t>
+      </w:r>
+    </w:p>
+    <w:p>
+      <w:pPr/>
+      <w:r>
+        <w:t>Na criação de um personagem de herança mista, Humano pode ser escolhido como Raça quando ao menos um de seus genitores for Humano. Registre a outra ascendência como Herança Familiar. Quando Humano for a raça manifestada, use integralmente apenas as características raciais Humanas; a ascendência não Humana não concede capacidades, compatibilidades ou limitações raciais adicionais.</w:t>
+      </w:r>
+    </w:p>
+    <w:p>
+      <w:pPr/>
+      <w:r>
+        <w:t>A Herança Familiar registra parentesco e aparência narrativa. Ela não constitui uma segunda Raça ou Povo e não concede automaticamente tradições, Competências de Lore, reputações ou contatos da cultura do outro genitor.</w:t>
+      </w:r>
+    </w:p>
+    <w:p>
+      <w:pPr>
+        <w:pStyle w:val="Heading2"/>
+      </w:pPr>
+      <w:r>
+        <w:t>Assimilação e Exílio</w:t>
+      </w:r>
+    </w:p>
+    <w:p>
+      <w:pPr/>
+      <w:r>
+        <w:t>Um Humano criado fora dos Reinos Humanos pode ser Assimilado à cultura local ou preservar uma tradição específica como Exilado. Assimilado e Exilado qualificam a origem; não substituem Povo, Procedência, Estrato Social ou Formação de Origem. A condição de Exilado justifica apenas aquilo que foi efetivamente transmitido por família, tutor, comunidade ou instituição e não concede automaticamente reputações, contatos ou conhecimentos cotidianos de uma terra onde o personagem nunca viveu.</w:t>
+      </w:r>
+    </w:p>
+    <w:p>
+      <w:pPr>
+        <w:pStyle w:val="Heading2"/>
+      </w:pPr>
+      <w:r>
+        <w:t>Formação Atípica</w:t>
+      </w:r>
+    </w:p>
+    <w:p>
+      <w:pPr/>
+      <w:r>
+        <w:t>As Procedências típicas representam os berços mais comuns da raça, não limites para a criação. Quando a Raça não for típica da Procedência escolhida, ou quando a Classe ou Ofício selecionado não possuir uma tradição normalmente disponível naquela comunidade, responda: Quem te ensinou a ser o que você é?</w:t>
+      </w:r>
+    </w:p>
+    <w:p>
+      <w:pPr/>
+      <w:r>
+        <w:t>Escolha normalmente Classes e Ofícios compatíveis com a raça. Um familiar, tutor, mestre, pequena comunidade ou instituição deve explicar como a formação chegou ao personagem. Essa resposta não possui custo mecânico, concede apenas a justificativa para os caminhos efetivamente escolhidos e não remove requisitos raciais ou outras compatibilidades.</w:t>
+      </w:r>
+    </w:p>
+    <w:p>
+      <w:pPr/>
+      <w:r>
+        <w:t>Exemplo. Um Humano criado em Selenthyr pode seguir Paladino ou Druida da Terra se um formador plausível lhe transmitiu essa tradição, mesmo que ela não seja ensinada normalmente na comunidade. Conhecer a cultura de Selenthyr não concede Torpor ou acesso a caminhos que exijam fisiologia Nyxiana.</w:t>
       </w:r>
     </w:p>
     <w:p>

</xml_diff>